<commit_message>
Deliverables: IEEE LaTeX+PDF, professional docx, 30-min overview, professor HTML; consolidate redundant report
- paper/cvgip2026_ieee.tex + .pdf (IEEEtran two-column, real equations/tables/figures, compiled via tectonic).
- docx/cvgip2026_paper.docx (professional: shaded headers, colored headings, embedded figures).
- PROJECT_OVERVIEW.md + docx/PROJECT_OVERVIEW.docx (30-min whole-project overview, tables + 6 figures).
- progress_report_professor.html (12-slide deck, template CSS+nav, MathJax, 4 figures base64-embedded).
- Folded SESSION_REPORT into progress_June_25-26.md (detailed-narrative section); deleted the duplicate;
  fixed its + the diary's stale MS-CXR/pooled-5 numbers; updated READING_GUIDE/STRUCTURE refs + paper sections.
- New fig_verifier_discrimination; converter tools paper/{md2docx,build_professor_html}.py; IEEEtran.cls vendored.

Co-Authored-By: Claude Opus 4.8 <noreply@anthropic.com>
Claude-Session: https://claude.ai/code/session_01Q8J4SpG8WQbTwXXZJxqG8U
</commit_message>
<xml_diff>
--- a/docx/READING_GUIDE.docx
+++ b/docx/READING_GUIDE.docx
@@ -5,8 +5,13 @@
     <w:p>
       <w:pPr>
         <w:pStyle w:val="Heading1"/>
+        <w:jc w:val="center"/>
       </w:pPr>
       <w:r>
+        <w:rPr>
+          <w:color w:val="3949AB"/>
+          <w:sz w:val="40"/>
+        </w:rPr>
         <w:t>Reading Guide — how to understand this whole project, in order</w:t>
       </w:r>
     </w:p>
@@ -183,7 +188,20 @@
         <w:rPr>
           <w:i/>
         </w:rPr>
-        <w:t xml:space="preserve">- </w:t>
+        <w:t xml:space="preserve">- the </w:t>
+      </w:r>
+      <w:r>
+        <w:rPr>
+          <w:b/>
+          <w:i/>
+        </w:rPr>
+        <w:t>Detailed narrative</w:t>
+      </w:r>
+      <w:r>
+        <w:rPr>
+          <w:i/>
+        </w:rPr>
+        <w:t xml:space="preserve"> section of </w:t>
       </w:r>
       <w:r>
         <w:rPr>
@@ -192,7 +210,7 @@
           <w:color w:val="B03060"/>
           <w:sz w:val="19"/>
         </w:rPr>
-        <w:t>SESSION_REPORT_trained_verifier.md</w:t>
+        <w:t>progress_June_25-26.md</w:t>
       </w:r>
       <w:r>
         <w:rPr>
@@ -449,6 +467,9 @@
         <w:pStyle w:val="Heading2"/>
       </w:pPr>
       <w:r>
+        <w:rPr>
+          <w:color w:val="3949AB"/>
+        </w:rPr>
         <w:t>PART 1 — Orientation: what is this project? (≈20 min) 🟢</w:t>
       </w:r>
     </w:p>
@@ -619,6 +640,9 @@
         <w:pStyle w:val="Heading2"/>
       </w:pPr>
       <w:r>
+        <w:rPr>
+          <w:color w:val="3949AB"/>
+        </w:rPr>
         <w:t>PART 2 — The research story, in the order it happened (≈1.5–2 hr) 🟡</w:t>
       </w:r>
     </w:p>
@@ -901,7 +925,16 @@
         <w:rPr>
           <w:b/>
         </w:rPr>
-        <w:t>Step 9 — `SESSION_REPORT_trained_verifier.md` (read the whole file — it's the best single document).</w:t>
+        <w:t xml:space="preserve">Step 9 — the </w:t>
+      </w:r>
+      <w:r>
+        <w:t>Detailed narrative</w:t>
+      </w:r>
+      <w:r>
+        <w:rPr>
+          <w:b/>
+        </w:rPr>
+        <w:t xml:space="preserve"> section of `progress_June_25-26.md` (read the whole file — it's the best single document).</w:t>
       </w:r>
       <w:r>
         <w:t xml:space="preserve"> 🟢</w:t>
@@ -975,6 +1008,9 @@
         <w:pStyle w:val="Heading2"/>
       </w:pPr>
       <w:r>
+        <w:rPr>
+          <w:color w:val="3949AB"/>
+        </w:rPr>
         <w:t>PART 3 — The polished story: the paper (≈1 hr) 🟡</w:t>
       </w:r>
     </w:p>
@@ -986,9 +1022,17 @@
     <w:p>
       <w:r>
         <w:rPr>
+          <w:i/>
+        </w:rPr>
+        <w:t>(The paper was restructured 2026-06-27 into a two-positive arc: ACC for efficiency + the trained verifier for accuracy, unified by the luck floor; the old §5.8 abstention section was removed.)</w:t>
+      </w:r>
+    </w:p>
+    <w:p>
+      <w:r>
+        <w:rPr>
           <w:b/>
         </w:rPr>
-        <w:t>Step 10 — `paper/cvgip2026_draft.md`, Abstract + §1 Introduction (especially the "Contributions" list).</w:t>
+        <w:t>Step 10 — `paper/cvgip2026_draft.md`, Abstract + §1 Introduction (the "Contributions" list (i)–(v)).</w:t>
       </w:r>
       <w:r>
         <w:t xml:space="preserve"> 🟢</w:t>
@@ -1002,7 +1046,7 @@
         <w:t>Learn:</w:t>
       </w:r>
       <w:r>
-        <w:t xml:space="preserve"> the entire project in ~2 pages, and the 7 numbered contributions (i–vii). </w:t>
+        <w:t xml:space="preserve"> the entire project in ~2 pages and the five contributions. </w:t>
       </w:r>
       <w:r>
         <w:rPr>
@@ -1011,12 +1055,7 @@
         <w:t>Why:</w:t>
       </w:r>
       <w:r>
-        <w:t xml:space="preserve"> the cleanest</w:t>
-      </w:r>
-    </w:p>
-    <w:p>
-      <w:r>
-        <w:t>top-down summary; the contributions list is your table of contents for §5.</w:t>
+        <w:t xml:space="preserve"> the cleanest top-down summary.</w:t>
       </w:r>
     </w:p>
     <w:p>
@@ -1024,7 +1063,7 @@
         <w:rPr>
           <w:b/>
         </w:rPr>
-        <w:t>Step 11 — paper §3 "Setup" + §4 "Method: the Adaptive-Compute Cascade (ACC)".</w:t>
+        <w:t>Step 11 — paper §3 "Setup" + §4 "Method I: the Adaptive-Compute Cascade (ACC)".</w:t>
       </w:r>
     </w:p>
     <w:p>
@@ -1035,7 +1074,7 @@
         <w:t>Learn:</w:t>
       </w:r>
       <w:r>
-        <w:t xml:space="preserve"> the models/datasets, and the precise 3-tier ACC method. </w:t>
+        <w:t xml:space="preserve"> the metrics/definitions (incl. the cost equation and the agreement-gate math) and the 3-tier ACC. </w:t>
       </w:r>
       <w:r>
         <w:rPr>
@@ -1052,7 +1091,7 @@
         <w:rPr>
           <w:b/>
         </w:rPr>
-        <w:t>Step 12 — paper §5.1 → §5.6.</w:t>
+        <w:t>Step 12 — paper §5.1 (ACC results) + §5.2 (the luck floor) + §5.3 (open-ended ceiling-break).</w:t>
       </w:r>
     </w:p>
     <w:p>
@@ -1063,17 +1102,7 @@
         <w:t>Learn:</w:t>
       </w:r>
       <w:r>
-        <w:t xml:space="preserve"> the ACC results and the "limits of routing" findings — §5.1 (ACC vs cascades), §5.2 (the gate is</w:t>
-      </w:r>
-    </w:p>
-    <w:p>
-      <w:r>
-        <w:t>saturated), §5.3 (cross-family headroom is unexploitable), §5.4 (language-prior), §5.5 (generalizes across</w:t>
-      </w:r>
-    </w:p>
-    <w:p>
-      <w:r>
-        <w:t xml:space="preserve">architectures), §5.6 (a trained gate + learnability). </w:t>
+        <w:t xml:space="preserve"> the efficiency win (−80% latency etc.), why no training-free gate/selector beats the baseline, and why open-ended evaluation matters. </w:t>
       </w:r>
       <w:r>
         <w:rPr>
@@ -1082,7 +1111,7 @@
         <w:t>Why:</w:t>
       </w:r>
       <w:r>
-        <w:t xml:space="preserve"> the evidence for the older half.</w:t>
+        <w:t xml:space="preserve"> the evidence for the first positive + the connective negative.</w:t>
       </w:r>
     </w:p>
     <w:p>
@@ -1090,10 +1119,10 @@
         <w:rPr>
           <w:b/>
         </w:rPr>
-        <w:t>Step 13 — paper §5.7 → §5.10</w:t>
+        <w:t>Step 13 — paper §6 "Method II: a Trained Outcome Verifier".</w:t>
       </w:r>
       <w:r>
-        <w:t xml:space="preserve"> (the recent, most novel results). 🟢</w:t>
+        <w:t xml:space="preserve"> 🟢</w:t>
       </w:r>
     </w:p>
     <w:p>
@@ -1104,26 +1133,7 @@
         <w:t>Learn:</w:t>
       </w:r>
       <w:r>
-        <w:t xml:space="preserve"> §5.7 open-ended ceiling-break, §5.8 abstention (a deprioritized side-result), §5.9 the luck floor,</w:t>
-      </w:r>
-    </w:p>
-    <w:p>
-      <w:r>
-        <w:t xml:space="preserve">§5.10 </w:t>
-      </w:r>
-      <w:r>
-        <w:rPr>
-          <w:b/>
-        </w:rPr>
-        <w:t>the trained verifier</w:t>
-      </w:r>
-      <w:r>
-        <w:t xml:space="preserve"> (the headline positive, with the scaling curve, the compute-beats-parameters</w:t>
-      </w:r>
-    </w:p>
-    <w:p>
-      <w:r>
-        <w:t xml:space="preserve">Pareto, and the bootstrap CIs). </w:t>
+        <w:t xml:space="preserve"> the verifier math (score, loss, best-of-N), the free-text result (49%), the box result (SLAKE + real MS-CXR), the AUROC-0.924 discrimination, the scaling curve, and the compute-beats-parameters Pareto. </w:t>
       </w:r>
       <w:r>
         <w:rPr>
@@ -1132,7 +1142,7 @@
         <w:t>Why:</w:t>
       </w:r>
       <w:r>
-        <w:t xml:space="preserve"> this is the frontier of the work; mirrors Steps 8–9.</w:t>
+        <w:t xml:space="preserve"> the second, most novel positive; mirrors Steps 8–9.</w:t>
       </w:r>
     </w:p>
     <w:p>
@@ -1140,7 +1150,7 @@
         <w:rPr>
           <w:b/>
         </w:rPr>
-        <w:t>Step 14 — paper §6 "Discussion &amp; Limitations" + §7 "Conclusion".</w:t>
+        <w:t>Step 14 — paper §7 "Discussion &amp; Limitations" + §8 "Conclusion".</w:t>
       </w:r>
     </w:p>
     <w:p>
@@ -1151,7 +1161,7 @@
         <w:t>Learn:</w:t>
       </w:r>
       <w:r>
-        <w:t xml:space="preserve"> honest scope, what is and isn't claimed, and the one-paragraph takeaway. </w:t>
+        <w:t xml:space="preserve"> honest scope (what is/ isn't novel), and the one-paragraph takeaway. </w:t>
       </w:r>
       <w:r>
         <w:rPr>
@@ -1160,12 +1170,7 @@
         <w:t>Why:</w:t>
       </w:r>
       <w:r>
-        <w:t xml:space="preserve"> tells you the</w:t>
-      </w:r>
-    </w:p>
-    <w:p>
-      <w:r>
-        <w:t>boundaries of every claim above.</w:t>
+        <w:t xml:space="preserve"> the boundaries of every claim.</w:t>
       </w:r>
     </w:p>
     <w:p>
@@ -1181,6 +1186,9 @@
         <w:pStyle w:val="Heading2"/>
       </w:pPr>
       <w:r>
+        <w:rPr>
+          <w:color w:val="3949AB"/>
+        </w:rPr>
         <w:t>PART 4 — The code (≈1 hr) 🔴</w:t>
       </w:r>
     </w:p>
@@ -1401,6 +1409,9 @@
         <w:pStyle w:val="Heading2"/>
       </w:pPr>
       <w:r>
+        <w:rPr>
+          <w:color w:val="3949AB"/>
+        </w:rPr>
         <w:t>PART 5 — Deep-dive appendices (reference only — read a file when you want full detail) 🔴</w:t>
       </w:r>
     </w:p>
@@ -1422,7 +1433,7 @@
     </w:p>
     <w:tbl>
       <w:tblPr>
-        <w:tblStyle w:val="LightGrid-Accent1"/>
+        <w:tblStyle w:val="TableGrid"/>
         <w:tblW w:type="auto" w:w="0"/>
         <w:tblLook w:firstColumn="1" w:firstRow="1" w:lastColumn="0" w:lastRow="0" w:noHBand="0" w:noVBand="1" w:val="04A0"/>
       </w:tblPr>
@@ -1434,11 +1445,14 @@
         <w:tc>
           <w:tcPr>
             <w:tcW w:type="dxa" w:w="4320"/>
+            <w:shd w:val="clear" w:fill="3949AB"/>
           </w:tcPr>
           <w:p>
             <w:r>
               <w:rPr>
                 <w:b/>
+                <w:color w:val="FFFFFF"/>
+                <w:sz w:val="19"/>
               </w:rPr>
               <w:t>If you want the full detail on…</w:t>
             </w:r>
@@ -1447,11 +1461,14 @@
         <w:tc>
           <w:tcPr>
             <w:tcW w:type="dxa" w:w="4320"/>
+            <w:shd w:val="clear" w:fill="3949AB"/>
           </w:tcPr>
           <w:p>
             <w:r>
               <w:rPr>
                 <w:b/>
+                <w:color w:val="FFFFFF"/>
+                <w:sz w:val="19"/>
               </w:rPr>
               <w:t>read</w:t>
             </w:r>
@@ -1462,9 +1479,13 @@
         <w:tc>
           <w:tcPr>
             <w:tcW w:type="dxa" w:w="4320"/>
+            <w:shd w:val="clear" w:fill="F2F5FB"/>
           </w:tcPr>
           <w:p>
             <w:r>
+              <w:rPr>
+                <w:sz w:val="19"/>
+              </w:rPr>
               <w:t>the ACC method, fully specified</w:t>
             </w:r>
           </w:p>
@@ -1472,6 +1493,7 @@
         <w:tc>
           <w:tcPr>
             <w:tcW w:type="dxa" w:w="4320"/>
+            <w:shd w:val="clear" w:fill="F2F5FB"/>
           </w:tcPr>
           <w:p>
             <w:r>
@@ -1492,6 +1514,9 @@
           </w:tcPr>
           <w:p>
             <w:r>
+              <w:rPr>
+                <w:sz w:val="19"/>
+              </w:rPr>
               <w:t>the equations / cost model behind ACC</w:t>
             </w:r>
           </w:p>
@@ -1530,9 +1555,13 @@
         <w:tc>
           <w:tcPr>
             <w:tcW w:type="dxa" w:w="4320"/>
+            <w:shd w:val="clear" w:fill="F2F5FB"/>
           </w:tcPr>
           <w:p>
             <w:r>
+              <w:rPr>
+                <w:sz w:val="19"/>
+              </w:rPr>
               <w:t>the trained free-text verifier</w:t>
             </w:r>
           </w:p>
@@ -1540,6 +1569,7 @@
         <w:tc>
           <w:tcPr>
             <w:tcW w:type="dxa" w:w="4320"/>
+            <w:shd w:val="clear" w:fill="F2F5FB"/>
           </w:tcPr>
           <w:p>
             <w:r>
@@ -1560,6 +1590,9 @@
           </w:tcPr>
           <w:p>
             <w:r>
+              <w:rPr>
+                <w:sz w:val="19"/>
+              </w:rPr>
               <w:t>the grounding box-verifier (SLAKE + MS-CXR)</w:t>
             </w:r>
           </w:p>
@@ -1584,9 +1617,13 @@
         <w:tc>
           <w:tcPr>
             <w:tcW w:type="dxa" w:w="4320"/>
+            <w:shd w:val="clear" w:fill="F2F5FB"/>
           </w:tcPr>
           <w:p>
             <w:r>
+              <w:rPr>
+                <w:sz w:val="19"/>
+              </w:rPr>
               <w:t>why training-free selection is luck-floored</w:t>
             </w:r>
           </w:p>
@@ -1594,6 +1631,7 @@
         <w:tc>
           <w:tcPr>
             <w:tcW w:type="dxa" w:w="4320"/>
+            <w:shd w:val="clear" w:fill="F2F5FB"/>
           </w:tcPr>
           <w:p>
             <w:r>
@@ -1614,6 +1652,9 @@
           </w:tcPr>
           <w:p>
             <w:r>
+              <w:rPr>
+                <w:sz w:val="19"/>
+              </w:rPr>
               <w:t>why the 32B's edge is capacity (not fixable cheaply)</w:t>
             </w:r>
           </w:p>
@@ -1638,9 +1679,13 @@
         <w:tc>
           <w:tcPr>
             <w:tcW w:type="dxa" w:w="4320"/>
+            <w:shd w:val="clear" w:fill="F2F5FB"/>
           </w:tcPr>
           <w:p>
             <w:r>
+              <w:rPr>
+                <w:sz w:val="19"/>
+              </w:rPr>
               <w:t>whether RAG could help</w:t>
             </w:r>
           </w:p>
@@ -1648,6 +1693,7 @@
         <w:tc>
           <w:tcPr>
             <w:tcW w:type="dxa" w:w="4320"/>
+            <w:shd w:val="clear" w:fill="F2F5FB"/>
           </w:tcPr>
           <w:p>
             <w:r>
@@ -1668,6 +1714,9 @@
           </w:tcPr>
           <w:p>
             <w:r>
+              <w:rPr>
+                <w:sz w:val="19"/>
+              </w:rPr>
               <w:t>a consolidated list of every result</w:t>
             </w:r>
           </w:p>
@@ -1714,9 +1763,13 @@
         <w:tc>
           <w:tcPr>
             <w:tcW w:type="dxa" w:w="4320"/>
+            <w:shd w:val="clear" w:fill="F2F5FB"/>
           </w:tcPr>
           <w:p>
             <w:r>
+              <w:rPr>
+                <w:sz w:val="19"/>
+              </w:rPr>
               <w:t>the cross-family / 2-size validation</w:t>
             </w:r>
           </w:p>
@@ -1724,6 +1777,7 @@
         <w:tc>
           <w:tcPr>
             <w:tcW w:type="dxa" w:w="4320"/>
+            <w:shd w:val="clear" w:fill="F2F5FB"/>
           </w:tcPr>
           <w:p>
             <w:r>
@@ -1744,6 +1798,9 @@
           </w:tcPr>
           <w:p>
             <w:r>
+              <w:rPr>
+                <w:sz w:val="19"/>
+              </w:rPr>
               <w:t>the visual-stability rescue + ACC-v3/v4</w:t>
             </w:r>
           </w:p>
@@ -1802,6 +1859,9 @@
         <w:pStyle w:val="Heading2"/>
       </w:pPr>
       <w:r>
+        <w:rPr>
+          <w:color w:val="3949AB"/>
+        </w:rPr>
         <w:t>The shortest honest summary of the whole project</w:t>
       </w:r>
     </w:p>

</xml_diff>